<commit_message>
Plásticos: composição do custo de setup no enunciado (sem máquina parada)
Co-Authored-By: Claude Opus 5.5 <noreply@anthropic.com>
Claude-Session: https://claude.ai/code/session_011MUGNEMWRsLJUKMUMKSx3L
</commit_message>
<xml_diff>
--- a/arquivos/Plasticos_Vale_do_Teles_Pires_Custos_MC_Enunciado.docx
+++ b/arquivos/Plasticos_Vale_do_Teles_Pires_Custos_MC_Enunciado.docx
@@ -38,7 +38,7 @@
         <w:spacing w:after="120"/>
       </w:pPr>
       <w:r>
-        <w:t>A Plásticos Vale do Teles Pires Ltda., indústria de injeção plástica instalada em Sinop (MT), fabrica embalagens plásticas para o agronegócio e para a indústria de alimentos: baldes de 20 litros (usados para insumos agrícolas), potes de 500 ml e frascos de 250 ml (uso alimentício). Cada produto é fabricado em um molde próprio (já totalmente depreciado), montado sobre uma base porta-moldes comum, na injetora. Trocar de produto exige parar a máquina, retirar o molde atual, instalar o novo molde e recalibrar o processo — uma operação chamada "troca de molde" (setup), que consome hora de técnico e hora de máquina parada, e cujo custo NÃO depende do tamanho do lote produzido depois da troca: custa o mesmo trocar o molde para produzir 5.000 ou 40.000 unidades. Estima-se que a fábrica permanecerá em operação por longo prazo. No último ano, foram produzidas e vendidas 200.000 unidades de baldes, 500.000 unidades de potes e 300.000 unidades de frascos, sem formação de estoque final de produtos acabados.</w:t>
+        <w:t>A Plásticos Vale do Teles Pires Ltda., indústria de injeção plástica instalada em Sinop (MT), fabrica embalagens plásticas para o agronegócio e para a indústria de alimentos: baldes de 20 litros (usados para insumos agrícolas), potes de 500 ml e frascos de 250 ml (uso alimentício). Cada produto é fabricado em um molde próprio (já totalmente depreciado), montado sobre uma base porta-moldes comum, na injetora. Trocar de produto exige parar a máquina, retirar o molde atual, instalar o novo molde e recalibrar o processo — uma operação chamada "troca de molde" (setup), cujo custo NÃO depende do tamanho do lote produzido depois da troca: custa o mesmo trocar o molde para produzir 5.000 ou 40.000 unidades. Estima-se que a fábrica permanecerá em operação por longo prazo. No último ano, foram produzidas e vendidas 200.000 unidades de baldes, 500.000 unidades de potes e 300.000 unidades de frascos, sem formação de estoque final de produtos acabados.</w:t>
       </w:r>
     </w:p>
     <w:p>
@@ -1536,7 +1536,7 @@
           <w:i/>
           <w:iCs/>
         </w:rPr>
-        <w:t xml:space="preserve">Observação: o custo por troca de molde já inclui a hora do técnico de manutenção e o custo estimado do tempo de máquina parada durante a troca. No cenário atual, cada produto é organizado em 10 lotes de produção por ano (uma troca de molde a cada aproximadamente 5 semanas), independentemente do tamanho de cada lote.</w:t>
+        <w:t>Observação: o custo por troca de molde reúne apenas os gastos que existem por causa de cada troca: o serviço do técnico de ferramentaria terceirizado, pago por troca; a resina usada na purga (limpeza) da injetora; e as primeiras peças refugadas até a calibragem. O tempo de máquina parada não entra nesse valor, porque a depreciação da injetora já está entre os gastos fixos. No cenário atual, cada produto é organizado em 10 lotes de produção por ano (uma troca de molde a cada aproximadamente 5 semanas), independentemente do tamanho de cada lote.</w:t>
       </w:r>
     </w:p>
     <w:p>

</xml_diff>